<commit_message>
docs: pilot proposal + technical dev prompt refresh, interface system tome
</commit_message>
<xml_diff>
--- a/docs/WHO_AFRO_TDR_Zisamale_Pilot_Proposal.docx
+++ b/docs/WHO_AFRO_TDR_Zisamale_Pilot_Proposal.docx
@@ -5438,20 +5438,6 @@
         <w:lang w:eastAsia="zh-CN"/>
       </w:rPr>
     </w:pPr>
-    <w:r>
-      <w:rPr>
-        <w:sz w:val="24"/>
-        <w:szCs w:val="24"/>
-      </w:rPr>
-      <w:t xml:space="preserve">Generated by </w:t>
-    </w:r>
-    <w:r>
-      <w:rPr>
-        <w:sz w:val="24"/>
-        <w:szCs w:val="24"/>
-      </w:rPr>
-      <w:t>Kimi</w:t>
-    </w:r>
   </w:p>
 </w:ftr>
 </file>

</xml_diff>